<commit_message>
Crash summary: crash 15's lead vehicle was turning left (diagram re-read)
Three independent readings of the diagram agreed with the as-drawn table
on 28 of 29 crashes; the rear-ended vehicle in crash 15 is drawn slowing
to turn left toward Pleasant Dr, not right. Table and memo corrected.

Co-Authored-By: Claude Fable 5.1 <noreply@anthropic.com>
Claude-Session: https://claude.ai/code/session_012AMZ23B9M2AjrQa7UP3LHH
</commit_message>
<xml_diff>
--- a/HSIP/41000079736/41000079736_CrashPatternSummary.docx
+++ b/HSIP/41000079736/41000079736_CrashPatternSummary.docx
@@ -4888,7 +4888,7 @@
           <w:sz w:val="21"/>
           <w:szCs w:val="21"/>
         </w:rPr>
-        <w:t xml:space="preserve">Northbound traffic appears in only four (9, 17, 23, 29). For a driver stopped on Pleasant Dr the 49 degree skew puts southbound traffic about 130 degrees behind the left shoulder, with the M&amp;D Quick Stop occupying the northwest quadrant between the stop line and the north leg; the north leg also bends slightly as it meets the intersection. Where the diagram governs: the TEAAS report codes the turning vehicle as a NC 180 unit in crashes 3, 13, 14, 19 and 24 and puts the minor-street vehicle on the opposite leg in 16 and 28; the diagram, drawn from the reports, shows the movements above, so no NC 180 turning pattern is counted (NC 180 vehicles are turning only as the struck vehicle in 24 and the vehicle rear-ended in 15).</w:t>
+        <w:t xml:space="preserve">Northbound traffic appears in only four (9, 17, 23, 29). For a driver stopped on Pleasant Dr the 49 degree skew puts southbound traffic about 130 degrees behind the left shoulder, with the M&amp;D Quick Stop occupying the northwest quadrant between the stop line and the north leg; the north leg also bends slightly as it meets the intersection. Where the diagram governs: the TEAAS report codes the turning vehicle as a NC 180 unit in crashes 3, 13, 14, 19 and 24 and puts the minor-street vehicle on the opposite leg in 16 and 28; the diagram, drawn from the reports, shows the movements above, so no NC 180 turning pattern is counted (NC 180 vehicles are turning only as the struck vehicle in 24 and the left-turning vehicle rear-ended in 15).</w:t>
       </w:r>
     </w:p>
     <w:p>
@@ -4916,7 +4916,7 @@
           <w:sz w:val="21"/>
           <w:szCs w:val="21"/>
         </w:rPr>
-        <w:t xml:space="preserve">Four are on the SR 1103 approaches behind a vehicle stopped at the stop sign (2 and 18 on Pleasant Dr, 8 and 20 on Pleasant Hill Church Rd); one (15) is northbound on NC 180 behind a vehicle slowing to turn right onto Pleasant Hill Church Rd.</w:t>
+        <w:t xml:space="preserve">Four are on the SR 1103 approaches behind a vehicle stopped at the stop sign (2 and 18 on Pleasant Dr, 8 and 20 on Pleasant Hill Church Rd); one (15) is northbound on NC 180 behind a vehicle slowing to turn left toward Pleasant Dr.</w:t>
       </w:r>
     </w:p>
     <w:p>
@@ -12744,7 +12744,7 @@
                 <w:sz w:val="15"/>
                 <w:szCs w:val="15"/>
               </w:rPr>
-              <w:t xml:space="preserve">Rear end on NC 180 northbound: struck a vehicle slowing/turning right ahead</w:t>
+              <w:t xml:space="preserve">Rear end on NC 180 northbound: struck a vehicle ahead slowing to turn left toward Pleasant Dr</w:t>
             </w:r>
           </w:p>
         </w:tc>

</xml_diff>